<commit_message>
Ajoute la configuration de mise en ligne sur Render
Blueprint render.yaml (service web Node, racine uniportal, npm start,
verification de sante sur /api/sante) et guide pas a pas dans le README :
creation du service, URL a declarer dans Auth0, mise en veille de l'offre
gratuite. Le chapitre 4 (Markdown et Word) mentionne la mise en ligne.

Co-Authored-By: Claude Opus 5.5 <noreply@anthropic.com>
Claude-Session: https://claude.ai/code/session_01PWyw5bindRp1LMtn8CWVZd
</commit_message>
<xml_diff>
--- a/docs/Chapitre4_UniPortal.docx
+++ b/docs/Chapitre4_UniPortal.docx
@@ -21977,6 +21977,75 @@
       </w:r>
       <w:r>
         <w:t xml:space="preserve"> : Auth0 considère ces deux origines comme différentes.</w:t>
+      </w:r>
+    </w:p>
+    <w:p>
+      <w:pPr>
+        <w:keepNext w:val="false"/>
+        <w:spacing w:after="140" w:line="300"/>
+        <w:jc w:val="both"/>
+      </w:pPr>
+      <w:r>
+        <w:rPr>
+          <w:b/>
+          <w:bCs/>
+        </w:rPr>
+        <w:t xml:space="preserve">Mise en ligne.</w:t>
+      </w:r>
+      <w:r>
+        <w:t xml:space="preserve"> Le fichier </w:t>
+      </w:r>
+      <w:r>
+        <w:rPr>
+          <w:rFonts w:ascii="Consolas" w:cs="Consolas" w:eastAsia="Consolas" w:hAnsi="Consolas"/>
+          <w:color w:val="312E81"/>
+          <w:sz w:val="19"/>
+          <w:szCs w:val="19"/>
+          <w:shd w:fill="EEF0FF" w:color="auto" w:val="clear"/>
+        </w:rPr>
+        <w:t xml:space="preserve">render.yaml</w:t>
+      </w:r>
+      <w:r>
+        <w:t xml:space="preserve"> permet de publier l'application sur Render, qui exécute </w:t>
+      </w:r>
+      <w:r>
+        <w:rPr>
+          <w:rFonts w:ascii="Consolas" w:cs="Consolas" w:eastAsia="Consolas" w:hAnsi="Consolas"/>
+          <w:color w:val="312E81"/>
+          <w:sz w:val="19"/>
+          <w:szCs w:val="19"/>
+          <w:shd w:fill="EEF0FF" w:color="auto" w:val="clear"/>
+        </w:rPr>
+        <w:t xml:space="preserve">npm start</w:t>
+      </w:r>
+      <w:r>
+        <w:t xml:space="preserve"> sans modification et fournit le HTTPS. L'adresse publique obtenue, par exemple </w:t>
+      </w:r>
+      <w:r>
+        <w:rPr>
+          <w:rFonts w:ascii="Consolas" w:cs="Consolas" w:eastAsia="Consolas" w:hAnsi="Consolas"/>
+          <w:color w:val="312E81"/>
+          <w:sz w:val="19"/>
+          <w:szCs w:val="19"/>
+          <w:shd w:fill="EEF0FF" w:color="auto" w:val="clear"/>
+        </w:rPr>
+        <w:t xml:space="preserve">https://uniportal.onrender.com</w:t>
+      </w:r>
+      <w:r>
+        <w:t xml:space="preserve">, doit être ajoutée aux URL autorisées de l'application Auth0 (§4.3.1). L'offre gratuite met le service en veille après une période d'inactivité et réinitialise alors les données en mémoire. La procédure détaillée figure dans le </w:t>
+      </w:r>
+      <w:r>
+        <w:rPr>
+          <w:rFonts w:ascii="Consolas" w:cs="Consolas" w:eastAsia="Consolas" w:hAnsi="Consolas"/>
+          <w:color w:val="312E81"/>
+          <w:sz w:val="19"/>
+          <w:szCs w:val="19"/>
+          <w:shd w:fill="EEF0FF" w:color="auto" w:val="clear"/>
+        </w:rPr>
+        <w:t xml:space="preserve">README.md</w:t>
+      </w:r>
+      <w:r>
+        <w:t xml:space="preserve">.</w:t>
       </w:r>
     </w:p>
     <w:p>

</xml_diff>